<commit_message>
Isoform note: add tab 29 motif counts table
Co-Authored-By: Claude Opus 5.5 <noreply@anthropic.com>
</commit_message>
<xml_diff>
--- a/ubr3_PG_reviewer/NDRG4_FBXO24_isoforms.docx
+++ b/ubr3_PG_reviewer/NDRG4_FBXO24_isoforms.docx
@@ -16,6 +16,584 @@
       </w:pPr>
       <w:r>
         <w:t xml:space="preserve">Both genes appear in the UBR3 substrate list (workbook tab 01), but in the combined [P/G]-[E/D] + MPT list (tab 29) their rows are marked as non-substrates, or the substrate is missing. This is not an error. It comes from how the GPS screen works.</w:t>
+      </w:r>
+    </w:p>
+    <w:p>
+      <w:pPr>
+        <w:pStyle w:val="Heading2"/>
+      </w:pPr>
+      <w:r>
+        <w:t xml:space="preserve">The combined [P/G]-[E/D] + MPT list (tab 29)</w:t>
+      </w:r>
+    </w:p>
+    <w:p>
+      <w:pPr>
+        <w:spacing w:after="120"/>
+      </w:pPr>
+      <w:r>
+        <w:t xml:space="preserve">Tab 29 merges tab 02 (all [P/G]-[E/D] peptides) and tab 27 (all MPT peptides) into one list, substrates and non-substrates together. The two motifs cannot overlap (position 3 is E/D in one, T in the other). These 20 substrates and 193 non-substrates are the same peptides behind Figures 15b, 16c and 17b.</w:t>
+      </w:r>
+    </w:p>
+    <w:tbl>
+      <w:tblPr>
+        <w:tblW w:type="dxa" w:w="8200"/>
+        <w:tblBorders>
+          <w:top w:val="single" w:color="auto" w:sz="4"/>
+          <w:left w:val="single" w:color="auto" w:sz="4"/>
+          <w:bottom w:val="single" w:color="auto" w:sz="4"/>
+          <w:right w:val="single" w:color="auto" w:sz="4"/>
+          <w:insideH w:val="single" w:color="auto" w:sz="4"/>
+          <w:insideV w:val="single" w:color="auto" w:sz="4"/>
+        </w:tblBorders>
+      </w:tblPr>
+      <w:tblGrid>
+        <w:gridCol w:w="2600"/>
+        <w:gridCol w:w="1600"/>
+        <w:gridCol w:w="2000"/>
+        <w:gridCol w:w="2000"/>
+      </w:tblGrid>
+      <w:tr>
+        <w:trPr>
+          <w:tblHeader/>
+        </w:trPr>
+        <w:tc>
+          <w:tcPr>
+            <w:tcW w:type="dxa" w:w="2600"/>
+            <w:tcBorders>
+              <w:top w:val="single" w:color="BFBFBF" w:sz="4"/>
+              <w:left w:val="single" w:color="BFBFBF" w:sz="4"/>
+              <w:bottom w:val="single" w:color="BFBFBF" w:sz="4"/>
+              <w:right w:val="single" w:color="BFBFBF" w:sz="4"/>
+            </w:tcBorders>
+            <w:shd w:fill="1F4E78" w:color="auto" w:val="clear"/>
+            <w:tcMar>
+              <w:top w:type="dxa" w:w="60"/>
+              <w:left w:type="dxa" w:w="90"/>
+              <w:bottom w:type="dxa" w:w="60"/>
+              <w:right w:type="dxa" w:w="90"/>
+            </w:tcMar>
+          </w:tcPr>
+          <w:p>
+            <w:pPr>
+              <w:jc w:val="left"/>
+            </w:pPr>
+            <w:r>
+              <w:rPr>
+                <w:b/>
+                <w:bCs/>
+                <w:color w:val="FFFFFF"/>
+                <w:sz w:val="19"/>
+                <w:szCs w:val="19"/>
+              </w:rPr>
+              <w:t xml:space="preserve">Motif</w:t>
+            </w:r>
+          </w:p>
+        </w:tc>
+        <w:tc>
+          <w:tcPr>
+            <w:tcW w:type="dxa" w:w="1600"/>
+            <w:tcBorders>
+              <w:top w:val="single" w:color="BFBFBF" w:sz="4"/>
+              <w:left w:val="single" w:color="BFBFBF" w:sz="4"/>
+              <w:bottom w:val="single" w:color="BFBFBF" w:sz="4"/>
+              <w:right w:val="single" w:color="BFBFBF" w:sz="4"/>
+            </w:tcBorders>
+            <w:shd w:fill="1F4E78" w:color="auto" w:val="clear"/>
+            <w:tcMar>
+              <w:top w:type="dxa" w:w="60"/>
+              <w:left w:type="dxa" w:w="90"/>
+              <w:bottom w:type="dxa" w:w="60"/>
+              <w:right w:type="dxa" w:w="90"/>
+            </w:tcMar>
+          </w:tcPr>
+          <w:p>
+            <w:pPr>
+              <w:jc w:val="center"/>
+            </w:pPr>
+            <w:r>
+              <w:rPr>
+                <w:b/>
+                <w:bCs/>
+                <w:color w:val="FFFFFF"/>
+                <w:sz w:val="19"/>
+                <w:szCs w:val="19"/>
+              </w:rPr>
+              <w:t xml:space="preserve">Peptides</w:t>
+            </w:r>
+          </w:p>
+        </w:tc>
+        <w:tc>
+          <w:tcPr>
+            <w:tcW w:type="dxa" w:w="2000"/>
+            <w:tcBorders>
+              <w:top w:val="single" w:color="BFBFBF" w:sz="4"/>
+              <w:left w:val="single" w:color="BFBFBF" w:sz="4"/>
+              <w:bottom w:val="single" w:color="BFBFBF" w:sz="4"/>
+              <w:right w:val="single" w:color="BFBFBF" w:sz="4"/>
+            </w:tcBorders>
+            <w:shd w:fill="1F4E78" w:color="auto" w:val="clear"/>
+            <w:tcMar>
+              <w:top w:type="dxa" w:w="60"/>
+              <w:left w:type="dxa" w:w="90"/>
+              <w:bottom w:type="dxa" w:w="60"/>
+              <w:right w:type="dxa" w:w="90"/>
+            </w:tcMar>
+          </w:tcPr>
+          <w:p>
+            <w:pPr>
+              <w:jc w:val="center"/>
+            </w:pPr>
+            <w:r>
+              <w:rPr>
+                <w:b/>
+                <w:bCs/>
+                <w:color w:val="FFFFFF"/>
+                <w:sz w:val="19"/>
+                <w:szCs w:val="19"/>
+              </w:rPr>
+              <w:t xml:space="preserve">UBR3 substrates</w:t>
+            </w:r>
+          </w:p>
+        </w:tc>
+        <w:tc>
+          <w:tcPr>
+            <w:tcW w:type="dxa" w:w="2000"/>
+            <w:tcBorders>
+              <w:top w:val="single" w:color="BFBFBF" w:sz="4"/>
+              <w:left w:val="single" w:color="BFBFBF" w:sz="4"/>
+              <w:bottom w:val="single" w:color="BFBFBF" w:sz="4"/>
+              <w:right w:val="single" w:color="BFBFBF" w:sz="4"/>
+            </w:tcBorders>
+            <w:shd w:fill="1F4E78" w:color="auto" w:val="clear"/>
+            <w:tcMar>
+              <w:top w:type="dxa" w:w="60"/>
+              <w:left w:type="dxa" w:w="90"/>
+              <w:bottom w:type="dxa" w:w="60"/>
+              <w:right w:type="dxa" w:w="90"/>
+            </w:tcMar>
+          </w:tcPr>
+          <w:p>
+            <w:pPr>
+              <w:jc w:val="center"/>
+            </w:pPr>
+            <w:r>
+              <w:rPr>
+                <w:b/>
+                <w:bCs/>
+                <w:color w:val="FFFFFF"/>
+                <w:sz w:val="19"/>
+                <w:szCs w:val="19"/>
+              </w:rPr>
+              <w:t xml:space="preserve">Non-substrates</w:t>
+            </w:r>
+          </w:p>
+        </w:tc>
+      </w:tr>
+      <w:tr>
+        <w:trPr>
+          <w:tblHeader w:val="off"/>
+        </w:trPr>
+        <w:tc>
+          <w:tcPr>
+            <w:tcW w:type="dxa" w:w="2600"/>
+            <w:tcBorders>
+              <w:top w:val="single" w:color="BFBFBF" w:sz="4"/>
+              <w:left w:val="single" w:color="BFBFBF" w:sz="4"/>
+              <w:bottom w:val="single" w:color="BFBFBF" w:sz="4"/>
+              <w:right w:val="single" w:color="BFBFBF" w:sz="4"/>
+            </w:tcBorders>
+            <w:tcMar>
+              <w:top w:type="dxa" w:w="60"/>
+              <w:left w:type="dxa" w:w="90"/>
+              <w:bottom w:type="dxa" w:w="60"/>
+              <w:right w:type="dxa" w:w="90"/>
+            </w:tcMar>
+          </w:tcPr>
+          <w:p>
+            <w:pPr>
+              <w:jc w:val="left"/>
+            </w:pPr>
+            <w:r>
+              <w:rPr>
+                <w:b w:val="false"/>
+                <w:bCs w:val="false"/>
+                <w:sz w:val="19"/>
+                <w:szCs w:val="19"/>
+              </w:rPr>
+              <w:t xml:space="preserve">[P/G]-[E/D]</w:t>
+            </w:r>
+          </w:p>
+        </w:tc>
+        <w:tc>
+          <w:tcPr>
+            <w:tcW w:type="dxa" w:w="1600"/>
+            <w:tcBorders>
+              <w:top w:val="single" w:color="BFBFBF" w:sz="4"/>
+              <w:left w:val="single" w:color="BFBFBF" w:sz="4"/>
+              <w:bottom w:val="single" w:color="BFBFBF" w:sz="4"/>
+              <w:right w:val="single" w:color="BFBFBF" w:sz="4"/>
+            </w:tcBorders>
+            <w:tcMar>
+              <w:top w:type="dxa" w:w="60"/>
+              <w:left w:type="dxa" w:w="90"/>
+              <w:bottom w:type="dxa" w:w="60"/>
+              <w:right w:type="dxa" w:w="90"/>
+            </w:tcMar>
+          </w:tcPr>
+          <w:p>
+            <w:pPr>
+              <w:jc w:val="center"/>
+            </w:pPr>
+            <w:r>
+              <w:rPr>
+                <w:b w:val="false"/>
+                <w:bCs w:val="false"/>
+                <w:sz w:val="19"/>
+                <w:szCs w:val="19"/>
+              </w:rPr>
+              <w:t xml:space="preserve">179</w:t>
+            </w:r>
+          </w:p>
+        </w:tc>
+        <w:tc>
+          <w:tcPr>
+            <w:tcW w:type="dxa" w:w="2000"/>
+            <w:tcBorders>
+              <w:top w:val="single" w:color="BFBFBF" w:sz="4"/>
+              <w:left w:val="single" w:color="BFBFBF" w:sz="4"/>
+              <w:bottom w:val="single" w:color="BFBFBF" w:sz="4"/>
+              <w:right w:val="single" w:color="BFBFBF" w:sz="4"/>
+            </w:tcBorders>
+            <w:tcMar>
+              <w:top w:type="dxa" w:w="60"/>
+              <w:left w:type="dxa" w:w="90"/>
+              <w:bottom w:type="dxa" w:w="60"/>
+              <w:right w:type="dxa" w:w="90"/>
+            </w:tcMar>
+          </w:tcPr>
+          <w:p>
+            <w:pPr>
+              <w:jc w:val="center"/>
+            </w:pPr>
+            <w:r>
+              <w:rPr>
+                <w:b w:val="false"/>
+                <w:bCs w:val="false"/>
+                <w:sz w:val="19"/>
+                <w:szCs w:val="19"/>
+              </w:rPr>
+              <w:t xml:space="preserve">16</w:t>
+            </w:r>
+          </w:p>
+        </w:tc>
+        <w:tc>
+          <w:tcPr>
+            <w:tcW w:type="dxa" w:w="2000"/>
+            <w:tcBorders>
+              <w:top w:val="single" w:color="BFBFBF" w:sz="4"/>
+              <w:left w:val="single" w:color="BFBFBF" w:sz="4"/>
+              <w:bottom w:val="single" w:color="BFBFBF" w:sz="4"/>
+              <w:right w:val="single" w:color="BFBFBF" w:sz="4"/>
+            </w:tcBorders>
+            <w:tcMar>
+              <w:top w:type="dxa" w:w="60"/>
+              <w:left w:type="dxa" w:w="90"/>
+              <w:bottom w:type="dxa" w:w="60"/>
+              <w:right w:type="dxa" w:w="90"/>
+            </w:tcMar>
+          </w:tcPr>
+          <w:p>
+            <w:pPr>
+              <w:jc w:val="center"/>
+            </w:pPr>
+            <w:r>
+              <w:rPr>
+                <w:b w:val="false"/>
+                <w:bCs w:val="false"/>
+                <w:sz w:val="19"/>
+                <w:szCs w:val="19"/>
+              </w:rPr>
+              <w:t xml:space="preserve">163</w:t>
+            </w:r>
+          </w:p>
+        </w:tc>
+      </w:tr>
+      <w:tr>
+        <w:trPr>
+          <w:tblHeader w:val="off"/>
+        </w:trPr>
+        <w:tc>
+          <w:tcPr>
+            <w:tcW w:type="dxa" w:w="2600"/>
+            <w:tcBorders>
+              <w:top w:val="single" w:color="BFBFBF" w:sz="4"/>
+              <w:left w:val="single" w:color="BFBFBF" w:sz="4"/>
+              <w:bottom w:val="single" w:color="BFBFBF" w:sz="4"/>
+              <w:right w:val="single" w:color="BFBFBF" w:sz="4"/>
+            </w:tcBorders>
+            <w:tcMar>
+              <w:top w:type="dxa" w:w="60"/>
+              <w:left w:type="dxa" w:w="90"/>
+              <w:bottom w:type="dxa" w:w="60"/>
+              <w:right w:type="dxa" w:w="90"/>
+            </w:tcMar>
+          </w:tcPr>
+          <w:p>
+            <w:pPr>
+              <w:jc w:val="left"/>
+            </w:pPr>
+            <w:r>
+              <w:rPr>
+                <w:b w:val="false"/>
+                <w:bCs w:val="false"/>
+                <w:sz w:val="19"/>
+                <w:szCs w:val="19"/>
+              </w:rPr>
+              <w:t xml:space="preserve">MPT</w:t>
+            </w:r>
+          </w:p>
+        </w:tc>
+        <w:tc>
+          <w:tcPr>
+            <w:tcW w:type="dxa" w:w="1600"/>
+            <w:tcBorders>
+              <w:top w:val="single" w:color="BFBFBF" w:sz="4"/>
+              <w:left w:val="single" w:color="BFBFBF" w:sz="4"/>
+              <w:bottom w:val="single" w:color="BFBFBF" w:sz="4"/>
+              <w:right w:val="single" w:color="BFBFBF" w:sz="4"/>
+            </w:tcBorders>
+            <w:tcMar>
+              <w:top w:type="dxa" w:w="60"/>
+              <w:left w:type="dxa" w:w="90"/>
+              <w:bottom w:type="dxa" w:w="60"/>
+              <w:right w:type="dxa" w:w="90"/>
+            </w:tcMar>
+          </w:tcPr>
+          <w:p>
+            <w:pPr>
+              <w:jc w:val="center"/>
+            </w:pPr>
+            <w:r>
+              <w:rPr>
+                <w:b w:val="false"/>
+                <w:bCs w:val="false"/>
+                <w:sz w:val="19"/>
+                <w:szCs w:val="19"/>
+              </w:rPr>
+              <w:t xml:space="preserve">34</w:t>
+            </w:r>
+          </w:p>
+        </w:tc>
+        <w:tc>
+          <w:tcPr>
+            <w:tcW w:type="dxa" w:w="2000"/>
+            <w:tcBorders>
+              <w:top w:val="single" w:color="BFBFBF" w:sz="4"/>
+              <w:left w:val="single" w:color="BFBFBF" w:sz="4"/>
+              <w:bottom w:val="single" w:color="BFBFBF" w:sz="4"/>
+              <w:right w:val="single" w:color="BFBFBF" w:sz="4"/>
+            </w:tcBorders>
+            <w:tcMar>
+              <w:top w:type="dxa" w:w="60"/>
+              <w:left w:type="dxa" w:w="90"/>
+              <w:bottom w:type="dxa" w:w="60"/>
+              <w:right w:type="dxa" w:w="90"/>
+            </w:tcMar>
+          </w:tcPr>
+          <w:p>
+            <w:pPr>
+              <w:jc w:val="center"/>
+            </w:pPr>
+            <w:r>
+              <w:rPr>
+                <w:b w:val="false"/>
+                <w:bCs w:val="false"/>
+                <w:sz w:val="19"/>
+                <w:szCs w:val="19"/>
+              </w:rPr>
+              <w:t xml:space="preserve">4</w:t>
+            </w:r>
+          </w:p>
+        </w:tc>
+        <w:tc>
+          <w:tcPr>
+            <w:tcW w:type="dxa" w:w="2000"/>
+            <w:tcBorders>
+              <w:top w:val="single" w:color="BFBFBF" w:sz="4"/>
+              <w:left w:val="single" w:color="BFBFBF" w:sz="4"/>
+              <w:bottom w:val="single" w:color="BFBFBF" w:sz="4"/>
+              <w:right w:val="single" w:color="BFBFBF" w:sz="4"/>
+            </w:tcBorders>
+            <w:tcMar>
+              <w:top w:type="dxa" w:w="60"/>
+              <w:left w:type="dxa" w:w="90"/>
+              <w:bottom w:type="dxa" w:w="60"/>
+              <w:right w:type="dxa" w:w="90"/>
+            </w:tcMar>
+          </w:tcPr>
+          <w:p>
+            <w:pPr>
+              <w:jc w:val="center"/>
+            </w:pPr>
+            <w:r>
+              <w:rPr>
+                <w:b w:val="false"/>
+                <w:bCs w:val="false"/>
+                <w:sz w:val="19"/>
+                <w:szCs w:val="19"/>
+              </w:rPr>
+              <w:t xml:space="preserve">30</w:t>
+            </w:r>
+          </w:p>
+        </w:tc>
+      </w:tr>
+      <w:tr>
+        <w:trPr>
+          <w:tblHeader w:val="off"/>
+        </w:trPr>
+        <w:tc>
+          <w:tcPr>
+            <w:tcW w:type="dxa" w:w="2600"/>
+            <w:tcBorders>
+              <w:top w:val="single" w:color="BFBFBF" w:sz="4"/>
+              <w:left w:val="single" w:color="BFBFBF" w:sz="4"/>
+              <w:bottom w:val="single" w:color="BFBFBF" w:sz="4"/>
+              <w:right w:val="single" w:color="BFBFBF" w:sz="4"/>
+            </w:tcBorders>
+            <w:shd w:fill="F2F2F2" w:color="auto" w:val="clear"/>
+            <w:tcMar>
+              <w:top w:type="dxa" w:w="60"/>
+              <w:left w:type="dxa" w:w="90"/>
+              <w:bottom w:type="dxa" w:w="60"/>
+              <w:right w:type="dxa" w:w="90"/>
+            </w:tcMar>
+          </w:tcPr>
+          <w:p>
+            <w:pPr>
+              <w:jc w:val="left"/>
+            </w:pPr>
+            <w:r>
+              <w:rPr>
+                <w:b/>
+                <w:bCs/>
+                <w:sz w:val="19"/>
+                <w:szCs w:val="19"/>
+              </w:rPr>
+              <w:t xml:space="preserve">Total</w:t>
+            </w:r>
+          </w:p>
+        </w:tc>
+        <w:tc>
+          <w:tcPr>
+            <w:tcW w:type="dxa" w:w="1600"/>
+            <w:tcBorders>
+              <w:top w:val="single" w:color="BFBFBF" w:sz="4"/>
+              <w:left w:val="single" w:color="BFBFBF" w:sz="4"/>
+              <w:bottom w:val="single" w:color="BFBFBF" w:sz="4"/>
+              <w:right w:val="single" w:color="BFBFBF" w:sz="4"/>
+            </w:tcBorders>
+            <w:shd w:fill="F2F2F2" w:color="auto" w:val="clear"/>
+            <w:tcMar>
+              <w:top w:type="dxa" w:w="60"/>
+              <w:left w:type="dxa" w:w="90"/>
+              <w:bottom w:type="dxa" w:w="60"/>
+              <w:right w:type="dxa" w:w="90"/>
+            </w:tcMar>
+          </w:tcPr>
+          <w:p>
+            <w:pPr>
+              <w:jc w:val="center"/>
+            </w:pPr>
+            <w:r>
+              <w:rPr>
+                <w:b/>
+                <w:bCs/>
+                <w:sz w:val="19"/>
+                <w:szCs w:val="19"/>
+              </w:rPr>
+              <w:t xml:space="preserve">213</w:t>
+            </w:r>
+          </w:p>
+        </w:tc>
+        <w:tc>
+          <w:tcPr>
+            <w:tcW w:type="dxa" w:w="2000"/>
+            <w:tcBorders>
+              <w:top w:val="single" w:color="BFBFBF" w:sz="4"/>
+              <w:left w:val="single" w:color="BFBFBF" w:sz="4"/>
+              <w:bottom w:val="single" w:color="BFBFBF" w:sz="4"/>
+              <w:right w:val="single" w:color="BFBFBF" w:sz="4"/>
+            </w:tcBorders>
+            <w:shd w:fill="F2F2F2" w:color="auto" w:val="clear"/>
+            <w:tcMar>
+              <w:top w:type="dxa" w:w="60"/>
+              <w:left w:type="dxa" w:w="90"/>
+              <w:bottom w:type="dxa" w:w="60"/>
+              <w:right w:type="dxa" w:w="90"/>
+            </w:tcMar>
+          </w:tcPr>
+          <w:p>
+            <w:pPr>
+              <w:jc w:val="center"/>
+            </w:pPr>
+            <w:r>
+              <w:rPr>
+                <w:b/>
+                <w:bCs/>
+                <w:sz w:val="19"/>
+                <w:szCs w:val="19"/>
+              </w:rPr>
+              <w:t xml:space="preserve">20</w:t>
+            </w:r>
+          </w:p>
+        </w:tc>
+        <w:tc>
+          <w:tcPr>
+            <w:tcW w:type="dxa" w:w="2000"/>
+            <w:tcBorders>
+              <w:top w:val="single" w:color="BFBFBF" w:sz="4"/>
+              <w:left w:val="single" w:color="BFBFBF" w:sz="4"/>
+              <w:bottom w:val="single" w:color="BFBFBF" w:sz="4"/>
+              <w:right w:val="single" w:color="BFBFBF" w:sz="4"/>
+            </w:tcBorders>
+            <w:shd w:fill="F2F2F2" w:color="auto" w:val="clear"/>
+            <w:tcMar>
+              <w:top w:type="dxa" w:w="60"/>
+              <w:left w:type="dxa" w:w="90"/>
+              <w:bottom w:type="dxa" w:w="60"/>
+              <w:right w:type="dxa" w:w="90"/>
+            </w:tcMar>
+          </w:tcPr>
+          <w:p>
+            <w:pPr>
+              <w:jc w:val="center"/>
+            </w:pPr>
+            <w:r>
+              <w:rPr>
+                <w:b/>
+                <w:bCs/>
+                <w:sz w:val="19"/>
+                <w:szCs w:val="19"/>
+              </w:rPr>
+              <w:t xml:space="preserve">193</w:t>
+            </w:r>
+          </w:p>
+        </w:tc>
+      </w:tr>
+    </w:tbl>
+    <w:p>
+      <w:pPr>
+        <w:spacing w:after="240" w:before="60"/>
+      </w:pPr>
+      <w:r>
+        <w:rPr>
+          <w:i/>
+          <w:iCs/>
+          <w:color w:val="595959"/>
+          <w:sz w:val="18"/>
+          <w:szCs w:val="18"/>
+        </w:rPr>
+        <w:t xml:space="preserve">Source: workbook UBR3_PG_substrate_tables.xlsx, tab 29_PGED_MPT_combined.</w:t>
       </w:r>
     </w:p>
     <w:p>

</xml_diff>